<commit_message>
ultimos detalles en el informe
</commit_message>
<xml_diff>
--- a/hito1/docs/informe_hito1.docx
+++ b/hito1/docs/informe_hito1.docx
@@ -4562,6 +4562,32 @@
     </w:p>
     <w:p>
       <w:pPr>
+        <w:spacing w:after="80" w:before="80"/>
+        <w:jc w:val="both"/>
+      </w:pPr>
+      <w:r>
+        <w:rPr>
+          <w:rFonts w:ascii="Arial" w:cs="Arial" w:eastAsia="Arial" w:hAnsi="Arial"/>
+          <w:sz w:val="22"/>
+          <w:szCs w:val="22"/>
+        </w:rPr>
+        <w:t xml:space="preserve">Un patrón arquitectónico es una solución ya probada y documentada para un problema recurrente en el diseño de sistemas de software. No son reglas obligatorias, sino guías basadas en la experiencia acumulada de muchos proyectos. A continuación se describen los cuatro patrones aplicados en este proyecto, explicando el problema concreto que resuelve cada uno, cómo se implementó y por qué fue la mejor opción disponible.</w:t>
+      </w:r>
+    </w:p>
+    <w:p>
+      <w:pPr>
+        <w:spacing w:after="80" w:before="0"/>
+      </w:pPr>
+      <w:r>
+        <w:rPr>
+          <w:sz w:val="22"/>
+          <w:szCs w:val="22"/>
+        </w:rPr>
+        <w:t xml:space="preserve"/>
+      </w:r>
+    </w:p>
+    <w:p>
+      <w:pPr>
         <w:pStyle w:val="Heading2"/>
         <w:spacing w:after="120" w:before="240"/>
       </w:pPr>
@@ -4597,7 +4623,7 @@
           <w:sz w:val="22"/>
           <w:szCs w:val="22"/>
         </w:rPr>
-        <w:t xml:space="preserve">El cliente necesita conocer las URLs de cada microservicio individualmente, lo que crea acoplamiento cliente-servicio y dificulta el balanceo de carga, autenticación centralizada y control de versiones.</w:t>
+        <w:t xml:space="preserve">Imagina que una empresa tiene tres departamentos distintos: uno para usuarios, otro para paquetes y otro para el seguimiento. Sin una recepción central, cada persona que llega al edificio tendría que saber exactamente en qué piso y oficina está cada departamento. Si el departamento se traslada o cambia de número, todas las personas que lo visitan deben actualizar esa información. En el sistema, ocurría exactamente eso: cada aplicación que consumiera la API necesitaría conocer la dirección exacta de cada microservicio por separado, lo que genera una dependencia frágil y difícil de mantener.</w:t>
       </w:r>
     </w:p>
     <w:p>
@@ -4620,7 +4646,7 @@
           <w:sz w:val="22"/>
           <w:szCs w:val="22"/>
         </w:rPr>
-        <w:t xml:space="preserve">Implementación de Nginx como reverse proxy en el puerto 8000, que enruta las peticiones según el prefijo de ruta: /users → user-service, /packages → package-service, /tracking → tracking-service.</w:t>
+        <w:t xml:space="preserve">Se implementó un API Gateway usando Nginx como punto único de entrada en el puerto 8000. Funciona como la recepcionista del edificio: el visitante (la aplicación cliente) solo necesita llegar a la puerta principal y decir qué necesita. El gateway se encarga de derivar la solicitud al servicio correcto: si la petición empieza con /users la envía al user-service, si empieza con /packages la envía al package-service, y si empieza con /tracking la envía al tracking-service.</w:t>
       </w:r>
     </w:p>
     <w:p>
@@ -4643,7 +4669,7 @@
           <w:sz w:val="22"/>
           <w:szCs w:val="22"/>
         </w:rPr>
-        <w:t xml:space="preserve">El cliente solo necesita conocer una URL (localhost:8000). El gateway centraliza aspectos transversales como timeouts (proxy_connect_timeout, proxy_read_timeout), manejo de errores de gateway (502/503/504) y forwarding de headers.</w:t>
+        <w:t xml:space="preserve">Este patrón se eligió porque simplifica enormemente el uso del sistema. En lugar de que quien consuma la API deba conocer y gestionar tres direcciones distintas, basta con una sola. Además, si mañana un microservicio cambia de servidor o de puerto, solo se actualiza la configuración del gateway, sin tocar nada externo. También permite agregar funcionalidades transversales en un solo lugar, como control de tiempos de espera, manejo de errores generales y registro de actividad, sin duplicar ese código en cada microservicio.</w:t>
       </w:r>
     </w:p>
     <w:p>
@@ -4666,7 +4692,7 @@
           <w:sz w:val="22"/>
           <w:szCs w:val="22"/>
         </w:rPr>
-        <w:t xml:space="preserve">Traefik (más complejo, ideal para Kubernetes), AWS API Gateway (solución cloud managed), FastAPI como gateway (viable pero agrega latencia Python).</w:t>
+        <w:t xml:space="preserve">Se evaluó Traefik, una alternativa más avanzada orientada a entornos con miles de servicios (Kubernetes), pero resultó excesivo para el tamaño de este proyecto. También se consideró AWS API Gateway, que es un servicio administrado en la nube de Amazon, descartado porque el proyecto debe correr localmente. Finalmente, se analizó construir el gateway directamente en Python con FastAPI, pero habría introducido una capa adicional de código a mantener sin ventajas reales frente a Nginx, que es más liviano y probado para esta función.</w:t>
       </w:r>
     </w:p>
     <w:p>
@@ -4718,7 +4744,7 @@
           <w:sz w:val="22"/>
           <w:szCs w:val="22"/>
         </w:rPr>
-        <w:t xml:space="preserve">La creación de un paquete requiere operaciones en dos bases de datos distintas (packages_db y tracking_db). Sin coordinación, una falla parcial dejaría el sistema en estado inconsistente (paquete creado sin evento inicial, o evento sin paquete asociado).</w:t>
+        <w:t xml:space="preserve">Cuando alguien compra un producto en línea, el sistema debe hacer varias cosas al mismo tiempo: descontar el stock, registrar el pago y generar la orden de despacho. ¿Qué pasa si el pago se procesa correctamente pero el sistema de despacho falla? El dinero fue cobrado pero el pedido nunca se generó, dejando al cliente en una situación inconsistente. En este proyecto, crear un paquete implica guardar datos en dos bases de datos distintas: la del servicio de paquetes y la del servicio de tracking. Si la segunda falla después de que la primera ya guardó los datos, el sistema queda en un estado incoherente: existe un paquete sin ningún estado de seguimiento asociado.</w:t>
       </w:r>
     </w:p>
     <w:p>
@@ -4741,7 +4767,7 @@
           <w:sz w:val="22"/>
           <w:szCs w:val="22"/>
         </w:rPr>
-        <w:t xml:space="preserve">Implementación de una Saga de coreografía simplificada orquestada por package-service: (1) validar usuario, (2) crear paquete en packages_db, (3) crear evento CREATED en tracking-service. Si el paso 3 falla, se ejecuta una transacción compensatoria que elimina el paquete creado en el paso 2, manteniendo la consistencia eventual del sistema.</w:t>
+        <w:t xml:space="preserve">Se implementó el Saga Pattern, que funciona como una cadena de pasos con un plan de reversa. Al crear un paquete, el sistema ejecuta tres pasos en orden: primero valida que el usuario exista, luego guarda el paquete en su base de datos, y por último registra el evento inicial en el servicio de tracking. Si el tercer paso falla, el sistema ejecuta automáticamente una acción compensatoria: elimina el paquete que guardó en el segundo paso, como si nunca hubiera existido. De esta manera, o todo el proceso sale bien, o todo queda como estaba antes de empezar.</w:t>
       </w:r>
     </w:p>
     <w:p>
@@ -4764,7 +4790,7 @@
           <w:sz w:val="22"/>
           <w:szCs w:val="22"/>
         </w:rPr>
-        <w:t xml:space="preserve">Las transacciones ACID distribuidas (2PC) son costosas y frágiles. El Saga Pattern permite consistencia eventual a través de transacciones locales con compensaciones, apropiado para el volumen y requisitos de este sistema.</w:t>
+        <w:t xml:space="preserve">La alternativa tradicional para garantizar que varias operaciones ocurran juntas o no ocurran en absoluto se llama transacción. Pero las transacciones clásicas solo funcionan dentro de una misma base de datos. Al tener bases de datos separadas por servicio, no es posible usar ese mecanismo. El Saga Pattern resuelve este problema de forma práctica: en lugar de bloquear todos los sistemas hasta que todo esté listo (lo que es costoso y propenso a fallos), define un plan de acción y un plan de reversa para cada paso, logrando una consistencia eventual que es suficientemente confiable para la mayoría de los sistemas reales.</w:t>
       </w:r>
     </w:p>
     <w:p>
@@ -4787,7 +4813,7 @@
           <w:sz w:val="22"/>
           <w:szCs w:val="22"/>
         </w:rPr>
-        <w:t xml:space="preserve">Two-Phase Commit (demasiado acoplado), Saga con orquestador dedicado como Apache Kafka (más robusto pero complejo para este alcance).</w:t>
+        <w:t xml:space="preserve">Se analizó el Two-Phase Commit (2PC), que es el protocolo clásico para coordinar transacciones entre múltiples bases de datos. Se descartó porque requiere que todos los servicios estén disponibles y coordinados en el mismo instante, lo que lo hace muy frágil ante fallos parciales de red. También se evaluó usar Apache Kafka como orquestador de eventos para una Saga más robusta, pero la complejidad de configuración era desproporcionada para el alcance de este proyecto.</w:t>
       </w:r>
     </w:p>
     <w:p>
@@ -4839,7 +4865,7 @@
           <w:sz w:val="22"/>
           <w:szCs w:val="22"/>
         </w:rPr>
-        <w:t xml:space="preserve">Cuando user-service no está disponible o responde lentamente, package-service acumula conexiones en espera, consume threads y puede colapsar por efecto cascada.</w:t>
+        <w:t xml:space="preserve">Imagina que llamas repetidamente al servicio de atención al cliente de una empresa, pero la línea siempre está ocupada. Cada vez que llamas, esperas varios minutos antes de recibir una señal de que no hay respuesta. Si esto le ocurre a miles de personas al mismo tiempo, el sistema de telefonía colapsa por la acumulación de llamadas en espera. En este proyecto, el servicio de paquetes necesita consultar al servicio de usuarios para verificar que el usuario existe antes de crear un envío. Si el servicio de usuarios se cae o responde muy lento, el servicio de paquetes acumularía miles de solicitudes en espera, consumiendo todos sus recursos hasta colapsar también, generando un efecto dominó que derrumba todo el sistema.</w:t>
       </w:r>
     </w:p>
     <w:p>
@@ -4862,7 +4888,7 @@
           <w:sz w:val="22"/>
           <w:szCs w:val="22"/>
         </w:rPr>
-        <w:t xml:space="preserve">Implementación con la librería pybreaker. El CircuitBreaker configurado con fail_max=3 y reset_timeout=30 abre el circuito tras 3 fallos consecutivos, retornando inmediatamente un error 503 durante 30 segundos antes de intentar nuevamente (estado HALF-OPEN).</w:t>
+        <w:t xml:space="preserve">Se implementó un Circuit Breaker (interruptor de circuito), que funciona exactamente igual que el disyuntor del tablero eléctrico de una casa. Cuando hay una sobrecarga, el disyuntor corta el circuito automáticamente para proteger el sistema. En el código, se usó la librería pybreaker: si el servicio de usuarios falla 3 veces seguidas, el interruptor se abre y durante los siguientes 30 segundos cualquier intento de contactarlo retorna inmediatamente un mensaje de error controlado, sin siquiera intentar la conexión. Transcurrido ese tiempo, el sistema prueba una vez más y, si el servicio se recuperó, cierra el interruptor y todo vuelve a la normalidad.</w:t>
       </w:r>
     </w:p>
     <w:p>
@@ -4885,7 +4911,7 @@
           <w:sz w:val="22"/>
           <w:szCs w:val="22"/>
         </w:rPr>
-        <w:t xml:space="preserve">El patrón previene el efecto cascada (cascade failure) en arquitecturas distribuidas. Cuando user-service está caído, los clientes reciben un error 503 descriptivo en millisegundos en lugar de esperar timeouts de 30+ segundos.</w:t>
+        <w:t xml:space="preserve">Sin este patrón, un fallo en el servicio de usuarios se propagaría silenciosamente hacia el servicio de paquetes, que comenzaría a acumular solicitudes bloqueadas hasta consumir toda su memoria y CPU. El Circuit Breaker convierte un fallo encadenado en un fallo controlado: en lugar de que el usuario espere 30 segundos para recibir un error confuso, recibe en milisegundos un mensaje claro indicando que el servicio no está disponible temporalmente. Esto protege al sistema completo y mejora la experiencia del usuario incluso durante incidentes.</w:t>
       </w:r>
     </w:p>
     <w:p>
@@ -4908,7 +4934,7 @@
           <w:sz w:val="22"/>
           <w:szCs w:val="22"/>
         </w:rPr>
-        <w:t xml:space="preserve">Retry con exponential backoff (complementario, no excluyente), Resilience4j para Java, Hystrix (deprecado por Netflix en favor de Resilience4j).</w:t>
+        <w:t xml:space="preserve">Se evaluó el Retry con Backoff Exponencial, que consiste en reintentar la operación fallida esperando cada vez más tiempo entre intentos. Es un patrón complementario al Circuit Breaker, no excluyente, y podría combinarse en una versión futura. También se analizó Resilience4j, una librería popular para Java que implementa Circuit Breaker, pero no aplica a este proyecto desarrollado en Python. Hystrix de Netflix fue otra alternativa revisada, pero fue oficialmente discontinuada y ya no recibe soporte.</w:t>
       </w:r>
     </w:p>
     <w:p>
@@ -4960,7 +4986,7 @@
           <w:sz w:val="22"/>
           <w:szCs w:val="22"/>
         </w:rPr>
-        <w:t xml:space="preserve">Una migración "big bang" del monolito a microservicios implica alto riesgo: reescribir todo a la vez sin posibilidad de rollback parcial, con alta probabilidad de regresiones.</w:t>
+        <w:t xml:space="preserve">Renovar completamente una casa mientras se sigue viviendo en ella es arriesgado: si se demuelen todas las paredes a la vez, la familia queda sin hogar. La solución natural es renovar habitación por habitación, viviendo en las partes ya renovadas mientras se trabaja en las demás. Migrar un sistema en producción funciona igual: reescribir todo el sistema de una vez, detener el servicio existente y lanzar el nuevo en un solo momento, es enormemente riesgoso. Cualquier error en el nuevo sistema deja a todos los usuarios sin servicio, y volver atrás puede ser imposible si los datos ya migraron.</w:t>
       </w:r>
     </w:p>
     <w:p>
@@ -4983,7 +5009,7 @@
           <w:sz w:val="22"/>
           <w:szCs w:val="22"/>
         </w:rPr>
-        <w:t xml:space="preserve">El Strangler Pattern permite una migración incremental coexistiendo el monolito y los nuevos microservicios durante la transición. El API Gateway actúa como el "estrangulador": inicialmente enruta todo al monolito, luego va redirigiendo rutas específicas a microservicios maduros.</w:t>
+        <w:t xml:space="preserve">El Strangler Fig Pattern (inspirado en la higuera estranguladora, una planta que crece gradualmente alrededor de un árbol hasta reemplazarlo) propone una migración incremental y sin interrupciones. El monolito original sigue funcionando mientras los nuevos microservicios se construyen y validan. El API Gateway actúa como el árbitro: inicialmente puede enrutar todo el tráfico al monolito, y paulatinamente va redirigiendo rutas específicas hacia los microservicios ya probados. Cuando todos los servicios están migrados y estables, el monolito simplemente se apaga, habiendo sido "estrangulado" progresivamente.</w:t>
       </w:r>
     </w:p>
     <w:p>
@@ -5006,7 +5032,7 @@
           <w:sz w:val="22"/>
           <w:szCs w:val="22"/>
         </w:rPr>
-        <w:t xml:space="preserve">Permite validar cada microservicio en producción antes de apagar el monolito. Facilita el rollback ruta a ruta. El riesgo se distribuye en el tiempo en lugar de concentrarse en un único evento de despliegue.</w:t>
+        <w:t xml:space="preserve">Este patrón se eligió porque elimina el mayor riesgo de una migración: el momento de corte. Al no existir un instante único donde todo cambia, cada microservicio puede validarse en condiciones reales de producción antes de asumir más responsabilidad. Si algo falla, basta con redirigir esa ruta de vuelta al monolito desde el gateway, sin necesidad de revertir toda la migración. El riesgo se distribuye en el tiempo, lo que hace el proceso mucho más seguro y manejable para los equipos de desarrollo.</w:t>
       </w:r>
     </w:p>
     <w:p>
@@ -5029,7 +5055,7 @@
           <w:sz w:val="22"/>
           <w:szCs w:val="22"/>
         </w:rPr>
-        <w:t xml:space="preserve">Feature Flags (complementario al Strangler), Branch by Abstraction (útil cuando el monolito no puede dividirse fácilmente por rutas HTTP).</w:t>
+        <w:t xml:space="preserve">Se consideraron los Feature Flags, que son interruptores en el código que permiten activar o desactivar funcionalidades sin redesplegar el sistema. Son un buen complemento al Strangler Pattern pero no lo reemplazan, ya que operan a nivel de funcionalidades y no de servicios completos. También se analizó Branch by Abstraction, una técnica que crea una capa intermedia en el código para ir reemplazando componentes internos gradualmente. Es útil cuando el sistema no puede separarse fácilmente por rutas HTTP, lo que no es el caso aquí.</w:t>
       </w:r>
     </w:p>
     <w:p>

</xml_diff>